<commit_message>
Publish clean public submission snapshot
</commit_message>
<xml_diff>
--- a/submission_package/supplementary_materials/supplementary_figures_embedded.docx
+++ b/submission_package/supplementary_materials/supplementary_figures_embedded.docx
@@ -2,7 +2,7 @@
 <file path=word/document.xml><?xml version="1.0" encoding="utf-8"?>
 <w:document xmlns:w="http://schemas.openxmlformats.org/wordprocessingml/2006/main" xmlns:m="http://schemas.openxmlformats.org/officeDocument/2006/math" xmlns:r="http://schemas.openxmlformats.org/officeDocument/2006/relationships" xmlns:o="urn:schemas-microsoft-com:office:office" xmlns:v="urn:schemas-microsoft-com:vml" xmlns:w10="urn:schemas-microsoft-com:office:word" xmlns:a="http://schemas.openxmlformats.org/drawingml/2006/main" xmlns:pic="http://schemas.openxmlformats.org/drawingml/2006/picture" xmlns:wp="http://schemas.openxmlformats.org/drawingml/2006/wordprocessingDrawing">
   <w:body>
-    <w:bookmarkStart w:id="26" w:name="supplementary-figures"/>
+    <w:bookmarkStart w:id="51" w:name="supplementary-figures"/>
     <w:p>
       <w:pPr>
         <w:pStyle w:val="Heading1"/>
@@ -25,7 +25,7 @@
         <w:t xml:space="preserve">“The Sentinel Firewall: A Health-System Strategy to Decouple Informal Industrialization from Lead Exposure in LMICs.”</w:t>
       </w:r>
     </w:p>
-    <w:bookmarkStart w:id="12" w:name="Xaaafb4bc6d1a4c2d820182640eb22ff908769b3"/>
+    <w:bookmarkStart w:id="33" w:name="Xaaafb4bc6d1a4c2d820182640eb22ff908769b3"/>
     <w:p>
       <w:pPr>
         <w:pStyle w:val="Heading2"/>
@@ -41,20 +41,20 @@
       <w:r>
         <w:drawing>
           <wp:inline>
-            <wp:extent cx="5334000" cy="3381620"/>
+            <wp:extent cx="5334000" cy="3333750"/>
             <wp:effectExtent b="0" l="0" r="0" t="0"/>
-            <wp:docPr descr="Figure A1. Probabilistic sensitivity analysis of the Kitchen Package" title="" id="10" name="Picture"/>
+            <wp:docPr descr="Figure A1. Probabilistic sensitivity analysis of the Kitchen Package" title="" id="31" name="Picture"/>
             <a:graphic>
               <a:graphicData uri="http://schemas.openxmlformats.org/drawingml/2006/picture">
                 <pic:pic>
                   <pic:nvPicPr>
-                    <pic:cNvPr descr="figure_a1_kitchen_bcr_distribution.png" id="11" name="Picture"/>
+                    <pic:cNvPr descr="figure_a1_kitchen_bcr_distribution.png" id="32" name="Picture"/>
                     <pic:cNvPicPr>
                       <a:picLocks noChangeArrowheads="1" noChangeAspect="1"/>
                     </pic:cNvPicPr>
                   </pic:nvPicPr>
                   <pic:blipFill>
-                    <a:blip r:embed="rId9"/>
+                    <a:blip r:embed="rId30"/>
                     <a:stretch>
                       <a:fillRect/>
                     </a:stretch>
@@ -62,7 +62,7 @@
                   <pic:spPr bwMode="auto">
                     <a:xfrm>
                       <a:off x="0" y="0"/>
-                      <a:ext cx="5334000" cy="3381620"/>
+                      <a:ext cx="5334000" cy="3333750"/>
                     </a:xfrm>
                     <a:prstGeom prst="rect">
                       <a:avLst/>
@@ -97,8 +97,8 @@
         <w:t xml:space="preserve">Figure A1 shows the distribution of the cognition-channel benefit-cost ratio (BCR) for the Kitchen Package across 10 000 Monte Carlo draws. The vertical dashed line at BCR=1 marks parity: simulations to the right of this line produce benefits greater than costs. The second dashed line marks the median BCR. The x-axis is truncated at the 99th percentile for readability, so a small number of high-BCR simulations are not shown in the far right tail.</w:t>
       </w:r>
     </w:p>
-    <w:bookmarkEnd w:id="12"/>
-    <w:bookmarkStart w:id="16" w:name="X452f9ef4f927723d3e5b9b460a2c9519c610c40"/>
+    <w:bookmarkEnd w:id="33"/>
+    <w:bookmarkStart w:id="37" w:name="X452f9ef4f927723d3e5b9b460a2c9519c610c40"/>
     <w:p>
       <w:pPr>
         <w:pStyle w:val="Heading2"/>
@@ -114,20 +114,20 @@
       <w:r>
         <w:drawing>
           <wp:inline>
-            <wp:extent cx="5334000" cy="3381620"/>
+            <wp:extent cx="5334000" cy="3333750"/>
             <wp:effectExtent b="0" l="0" r="0" t="0"/>
-            <wp:docPr descr="Figure A2. Probabilistic sensitivity analysis of the Kohl Package" title="" id="14" name="Picture"/>
+            <wp:docPr descr="Figure A2. Probabilistic sensitivity analysis of the Kohl Package" title="" id="35" name="Picture"/>
             <a:graphic>
               <a:graphicData uri="http://schemas.openxmlformats.org/drawingml/2006/picture">
                 <pic:pic>
                   <pic:nvPicPr>
-                    <pic:cNvPr descr="figure_a2_kohl_bcr_distribution.png" id="15" name="Picture"/>
+                    <pic:cNvPr descr="figure_a2_kohl_bcr_distribution.png" id="36" name="Picture"/>
                     <pic:cNvPicPr>
                       <a:picLocks noChangeArrowheads="1" noChangeAspect="1"/>
                     </pic:cNvPicPr>
                   </pic:nvPicPr>
                   <pic:blipFill>
-                    <a:blip r:embed="rId13"/>
+                    <a:blip r:embed="rId34"/>
                     <a:stretch>
                       <a:fillRect/>
                     </a:stretch>
@@ -135,7 +135,7 @@
                   <pic:spPr bwMode="auto">
                     <a:xfrm>
                       <a:off x="0" y="0"/>
-                      <a:ext cx="5334000" cy="3381620"/>
+                      <a:ext cx="5334000" cy="3333750"/>
                     </a:xfrm>
                     <a:prstGeom prst="rect">
                       <a:avLst/>
@@ -170,8 +170,8 @@
         <w:t xml:space="preserve">Figure A2 shows the distribution of the cognition-channel BCR for the Kohl Package across 10 000 Monte Carlo draws. As in Figure A1, the parity line marks BCR=1 and the median line marks the central simulation result. Compared with the Kitchen Package, the Kohl Package has a wider lower tail, reflecting greater sensitivity to local kohl use, infant reach, sex-specific practice and duration of substitute use. The x-axis is truncated at the 99th percentile for readability.</w:t>
       </w:r>
     </w:p>
-    <w:bookmarkEnd w:id="16"/>
-    <w:bookmarkStart w:id="20" w:name="Xcbe3d31a73030d23825c5c2f1e1ca0b79e67524"/>
+    <w:bookmarkEnd w:id="37"/>
+    <w:bookmarkStart w:id="41" w:name="Xcbe3d31a73030d23825c5c2f1e1ca0b79e67524"/>
     <w:p>
       <w:pPr>
         <w:pStyle w:val="Heading2"/>
@@ -187,20 +187,20 @@
       <w:r>
         <w:drawing>
           <wp:inline>
-            <wp:extent cx="5334000" cy="3872136"/>
+            <wp:extent cx="5334000" cy="3556000"/>
             <wp:effectExtent b="0" l="0" r="0" t="0"/>
-            <wp:docPr descr="Figure A3. Tornado diagram for Kitchen Package cognition-channel BCR" title="" id="18" name="Picture"/>
+            <wp:docPr descr="Figure A3. Tornado diagram for Kitchen Package cognition-channel BCR" title="" id="39" name="Picture"/>
             <a:graphic>
               <a:graphicData uri="http://schemas.openxmlformats.org/drawingml/2006/picture">
                 <pic:pic>
                   <pic:nvPicPr>
-                    <pic:cNvPr descr="figure_a3_kitchen_tornado.png" id="19" name="Picture"/>
+                    <pic:cNvPr descr="figure_a3_kitchen_tornado.png" id="40" name="Picture"/>
                     <pic:cNvPicPr>
                       <a:picLocks noChangeArrowheads="1" noChangeAspect="1"/>
                     </pic:cNvPicPr>
                   </pic:nvPicPr>
                   <pic:blipFill>
-                    <a:blip r:embed="rId17"/>
+                    <a:blip r:embed="rId38"/>
                     <a:stretch>
                       <a:fillRect/>
                     </a:stretch>
@@ -208,7 +208,7 @@
                   <pic:spPr bwMode="auto">
                     <a:xfrm>
                       <a:off x="0" y="0"/>
-                      <a:ext cx="5334000" cy="3872136"/>
+                      <a:ext cx="5334000" cy="3556000"/>
                     </a:xfrm>
                     <a:prstGeom prst="rect">
                       <a:avLst/>
@@ -315,8 +315,8 @@
         <w:t xml:space="preserve">The Kitchen Package remains most sensitive to parameters governing biological efficacy and long-run valuation: how much the safe pot reduces child blood lead, how strongly blood lead affects cognition, how strongly cognition affects earnings and how heavily future earnings are discounted. Implementation parameters also matter, especially because the pot pathway requires voucher issuance, merchant stock, redemption and sustained targeted use.</w:t>
       </w:r>
     </w:p>
-    <w:bookmarkEnd w:id="20"/>
-    <w:bookmarkStart w:id="24" w:name="Xeffcc4ff8affa968d38c6ceb3cc6ca7ba0dcb57"/>
+    <w:bookmarkEnd w:id="41"/>
+    <w:bookmarkStart w:id="45" w:name="Xeffcc4ff8affa968d38c6ceb3cc6ca7ba0dcb57"/>
     <w:p>
       <w:pPr>
         <w:pStyle w:val="Heading2"/>
@@ -332,20 +332,20 @@
       <w:r>
         <w:drawing>
           <wp:inline>
-            <wp:extent cx="5334000" cy="3873676"/>
+            <wp:extent cx="5334000" cy="3556000"/>
             <wp:effectExtent b="0" l="0" r="0" t="0"/>
-            <wp:docPr descr="Figure A4. Tornado diagram for Kohl Package cognition-channel BCR" title="" id="22" name="Picture"/>
+            <wp:docPr descr="Figure A4. Tornado diagram for Kohl Package cognition-channel BCR" title="" id="43" name="Picture"/>
             <a:graphic>
               <a:graphicData uri="http://schemas.openxmlformats.org/drawingml/2006/picture">
                 <pic:pic>
                   <pic:nvPicPr>
-                    <pic:cNvPr descr="figure_a4_kohl_tornado.png" id="23" name="Picture"/>
+                    <pic:cNvPr descr="figure_a4_kohl_tornado.png" id="44" name="Picture"/>
                     <pic:cNvPicPr>
                       <a:picLocks noChangeArrowheads="1" noChangeAspect="1"/>
                     </pic:cNvPicPr>
                   </pic:nvPicPr>
                   <pic:blipFill>
-                    <a:blip r:embed="rId21"/>
+                    <a:blip r:embed="rId42"/>
                     <a:stretch>
                       <a:fillRect/>
                     </a:stretch>
@@ -353,7 +353,7 @@
                   <pic:spPr bwMode="auto">
                     <a:xfrm>
                       <a:off x="0" y="0"/>
-                      <a:ext cx="5334000" cy="3873676"/>
+                      <a:ext cx="5334000" cy="3556000"/>
                     </a:xfrm>
                     <a:prstGeom prst="rect">
                       <a:avLst/>
@@ -448,8 +448,81 @@
         <w:t xml:space="preserve">The Kohl Package is especially sensitive to local practice: the prevalence of leaded maternal and infant kohl, whether infant kohl use affects boys as well as girls, the size of the infant kohl BLL effect and whether infants are reached through facility delivery or early-immunisation catch-up. The economic case is also sensitive to the same general valuation parameters as the Kitchen Package: the BLL-to-IQ relationship, earnings gains per IQ point and discounting.</w:t>
       </w:r>
     </w:p>
-    <w:bookmarkEnd w:id="24"/>
-    <w:bookmarkStart w:id="25" w:name="notes-on-figure-files"/>
+    <w:bookmarkEnd w:id="45"/>
+    <w:bookmarkStart w:id="49" w:name="Xa1b7d744855bf23736a497b969f079ff2488e5a"/>
+    <w:p>
+      <w:pPr>
+        <w:pStyle w:val="Heading2"/>
+      </w:pPr>
+      <w:r>
+        <w:t xml:space="preserve">Figure A5. Simplified timing pathways for the Kitchen Package</w:t>
+      </w:r>
+    </w:p>
+    <w:p>
+      <w:pPr>
+        <w:pStyle w:val="CaptionedFigure"/>
+      </w:pPr>
+      <w:r>
+        <w:drawing>
+          <wp:inline>
+            <wp:extent cx="5334000" cy="2834853"/>
+            <wp:effectExtent b="0" l="0" r="0" t="0"/>
+            <wp:docPr descr="Figure A5. Simplified timing pathways for the Kitchen Package" title="" id="47" name="Picture"/>
+            <a:graphic>
+              <a:graphicData uri="http://schemas.openxmlformats.org/drawingml/2006/picture">
+                <pic:pic>
+                  <pic:nvPicPr>
+                    <pic:cNvPr descr="figure_a5_kitchen_timing_pathways.png" id="48" name="Picture"/>
+                    <pic:cNvPicPr>
+                      <a:picLocks noChangeArrowheads="1" noChangeAspect="1"/>
+                    </pic:cNvPicPr>
+                  </pic:nvPicPr>
+                  <pic:blipFill>
+                    <a:blip r:embed="rId46"/>
+                    <a:stretch>
+                      <a:fillRect/>
+                    </a:stretch>
+                  </pic:blipFill>
+                  <pic:spPr bwMode="auto">
+                    <a:xfrm>
+                      <a:off x="0" y="0"/>
+                      <a:ext cx="5334000" cy="2834853"/>
+                    </a:xfrm>
+                    <a:prstGeom prst="rect">
+                      <a:avLst/>
+                    </a:prstGeom>
+                    <a:noFill/>
+                    <a:ln w="9525">
+                      <a:noFill/>
+                      <a:headEnd/>
+                      <a:tailEnd/>
+                    </a:ln>
+                  </pic:spPr>
+                </pic:pic>
+              </a:graphicData>
+            </a:graphic>
+          </wp:inline>
+        </w:drawing>
+      </w:r>
+    </w:p>
+    <w:p>
+      <w:pPr>
+        <w:pStyle w:val="ImageCaption"/>
+      </w:pPr>
+      <w:r>
+        <w:t xml:space="preserve">Figure A5. Simplified timing pathways for the Kitchen Package</w:t>
+      </w:r>
+    </w:p>
+    <w:p>
+      <w:pPr>
+        <w:pStyle w:val="BodyText"/>
+      </w:pPr>
+      <w:r>
+        <w:t xml:space="preserve">Figure A5 summarizes the timing assumptions in the Kitchen Package. Calcium supplementation affects child exposure only through reduced maternal blood lead during pregnancy. Safe pot voucher and substitution affect child exposure through prenatal transfer, maternal exposure while nursing, and direct food pathways after complementary feeding begins. Safe child utensils affect child exposure only after complementary feeding begins. The figure is intentionally simplified and should be read together with Appendix Table A1, which states the exact modeled assumptions for each pathway and age window.</w:t>
+      </w:r>
+    </w:p>
+    <w:bookmarkEnd w:id="49"/>
+    <w:bookmarkStart w:id="50" w:name="notes-on-figure-files"/>
     <w:p>
       <w:pPr>
         <w:pStyle w:val="Heading2"/>
@@ -594,8 +667,38 @@
         <w:t xml:space="preserve">figure_a4_kohl_tornado.pdf</w:t>
       </w:r>
     </w:p>
-    <w:bookmarkEnd w:id="25"/>
-    <w:bookmarkEnd w:id="26"/>
+    <w:p>
+      <w:pPr>
+        <w:pStyle w:val="Compact"/>
+        <w:numPr>
+          <w:ilvl w:val="0"/>
+          <w:numId w:val="1003"/>
+        </w:numPr>
+      </w:pPr>
+      <w:r>
+        <w:rPr>
+          <w:rStyle w:val="VerbatimChar"/>
+        </w:rPr>
+        <w:t xml:space="preserve">figure_a5_kitchen_timing_pathways.png</w:t>
+      </w:r>
+    </w:p>
+    <w:p>
+      <w:pPr>
+        <w:pStyle w:val="Compact"/>
+        <w:numPr>
+          <w:ilvl w:val="0"/>
+          <w:numId w:val="1003"/>
+        </w:numPr>
+      </w:pPr>
+      <w:r>
+        <w:rPr>
+          <w:rStyle w:val="VerbatimChar"/>
+        </w:rPr>
+        <w:t xml:space="preserve">figure_a5_kitchen_timing_pathways.svg</w:t>
+      </w:r>
+    </w:p>
+    <w:bookmarkEnd w:id="50"/>
+    <w:bookmarkEnd w:id="51"/>
     <w:sectPr>
       <w:footnotePr>
         <w:numRestart w:val="eachSect"/>
@@ -1480,7 +1583,7 @@
       <w:color w:themeColor="accent1" w:themeShade="BF" w:val="365F91"/>
     </w:rPr>
   </w:style>
-  <w:style w:type="paragraph" w:customStyle="1" w:styleId="SourceCode">
+  <w:style w:customStyle="1" w:styleId="SourceCode" w:type="paragraph">
     <w:name w:val="Source Code"/>
     <w:basedOn w:val="Normal"/>
     <w:link w:val="VerbatimChar"/>
@@ -1488,7 +1591,7 @@
       <w:wordWrap w:val="off"/>
     </w:pPr>
   </w:style>
-  <w:style w:type="character" w:customStyle="1" w:styleId="KeywordTok">
+  <w:style w:customStyle="1" w:styleId="KeywordTok" w:type="character">
     <w:name w:val="KeywordTok"/>
     <w:basedOn w:val="VerbatimChar"/>
     <w:rPr>
@@ -1496,77 +1599,77 @@
       <w:color w:val="007020"/>
     </w:rPr>
   </w:style>
-  <w:style w:type="character" w:customStyle="1" w:styleId="DataTypeTok">
+  <w:style w:customStyle="1" w:styleId="DataTypeTok" w:type="character">
     <w:name w:val="DataTypeTok"/>
     <w:basedOn w:val="VerbatimChar"/>
     <w:rPr>
       <w:color w:val="902000"/>
     </w:rPr>
   </w:style>
-  <w:style w:type="character" w:customStyle="1" w:styleId="DecValTok">
+  <w:style w:customStyle="1" w:styleId="DecValTok" w:type="character">
     <w:name w:val="DecValTok"/>
     <w:basedOn w:val="VerbatimChar"/>
     <w:rPr>
       <w:color w:val="40a070"/>
     </w:rPr>
   </w:style>
-  <w:style w:type="character" w:customStyle="1" w:styleId="BaseNTok">
+  <w:style w:customStyle="1" w:styleId="BaseNTok" w:type="character">
     <w:name w:val="BaseNTok"/>
     <w:basedOn w:val="VerbatimChar"/>
     <w:rPr>
       <w:color w:val="40a070"/>
     </w:rPr>
   </w:style>
-  <w:style w:type="character" w:customStyle="1" w:styleId="FloatTok">
+  <w:style w:customStyle="1" w:styleId="FloatTok" w:type="character">
     <w:name w:val="FloatTok"/>
     <w:basedOn w:val="VerbatimChar"/>
     <w:rPr>
       <w:color w:val="40a070"/>
     </w:rPr>
   </w:style>
-  <w:style w:type="character" w:customStyle="1" w:styleId="ConstantTok">
+  <w:style w:customStyle="1" w:styleId="ConstantTok" w:type="character">
     <w:name w:val="ConstantTok"/>
     <w:basedOn w:val="VerbatimChar"/>
     <w:rPr>
       <w:color w:val="880000"/>
     </w:rPr>
   </w:style>
-  <w:style w:type="character" w:customStyle="1" w:styleId="CharTok">
+  <w:style w:customStyle="1" w:styleId="CharTok" w:type="character">
     <w:name w:val="CharTok"/>
     <w:basedOn w:val="VerbatimChar"/>
     <w:rPr>
       <w:color w:val="4070a0"/>
     </w:rPr>
   </w:style>
-  <w:style w:type="character" w:customStyle="1" w:styleId="SpecialCharTok">
+  <w:style w:customStyle="1" w:styleId="SpecialCharTok" w:type="character">
     <w:name w:val="SpecialCharTok"/>
     <w:basedOn w:val="VerbatimChar"/>
     <w:rPr>
       <w:color w:val="4070a0"/>
     </w:rPr>
   </w:style>
-  <w:style w:type="character" w:customStyle="1" w:styleId="StringTok">
+  <w:style w:customStyle="1" w:styleId="StringTok" w:type="character">
     <w:name w:val="StringTok"/>
     <w:basedOn w:val="VerbatimChar"/>
     <w:rPr>
       <w:color w:val="4070a0"/>
     </w:rPr>
   </w:style>
-  <w:style w:type="character" w:customStyle="1" w:styleId="VerbatimStringTok">
+  <w:style w:customStyle="1" w:styleId="VerbatimStringTok" w:type="character">
     <w:name w:val="VerbatimStringTok"/>
     <w:basedOn w:val="VerbatimChar"/>
     <w:rPr>
       <w:color w:val="4070a0"/>
     </w:rPr>
   </w:style>
-  <w:style w:type="character" w:customStyle="1" w:styleId="SpecialStringTok">
+  <w:style w:customStyle="1" w:styleId="SpecialStringTok" w:type="character">
     <w:name w:val="SpecialStringTok"/>
     <w:basedOn w:val="VerbatimChar"/>
     <w:rPr>
       <w:color w:val="bb6688"/>
     </w:rPr>
   </w:style>
-  <w:style w:type="character" w:customStyle="1" w:styleId="ImportTok">
+  <w:style w:customStyle="1" w:styleId="ImportTok" w:type="character">
     <w:name w:val="ImportTok"/>
     <w:basedOn w:val="VerbatimChar"/>
     <w:rPr>
@@ -1574,7 +1677,7 @@
       <w:color w:val="008000"/>
     </w:rPr>
   </w:style>
-  <w:style w:type="character" w:customStyle="1" w:styleId="CommentTok">
+  <w:style w:customStyle="1" w:styleId="CommentTok" w:type="character">
     <w:name w:val="CommentTok"/>
     <w:basedOn w:val="VerbatimChar"/>
     <w:rPr>
@@ -1582,7 +1685,7 @@
       <w:color w:val="60a0b0"/>
     </w:rPr>
   </w:style>
-  <w:style w:type="character" w:customStyle="1" w:styleId="DocumentationTok">
+  <w:style w:customStyle="1" w:styleId="DocumentationTok" w:type="character">
     <w:name w:val="DocumentationTok"/>
     <w:basedOn w:val="VerbatimChar"/>
     <w:rPr>
@@ -1590,7 +1693,7 @@
       <w:color w:val="ba2121"/>
     </w:rPr>
   </w:style>
-  <w:style w:type="character" w:customStyle="1" w:styleId="AnnotationTok">
+  <w:style w:customStyle="1" w:styleId="AnnotationTok" w:type="character">
     <w:name w:val="AnnotationTok"/>
     <w:basedOn w:val="VerbatimChar"/>
     <w:rPr>
@@ -1599,7 +1702,7 @@
       <w:color w:val="60a0b0"/>
     </w:rPr>
   </w:style>
-  <w:style w:type="character" w:customStyle="1" w:styleId="CommentVarTok">
+  <w:style w:customStyle="1" w:styleId="CommentVarTok" w:type="character">
     <w:name w:val="CommentVarTok"/>
     <w:basedOn w:val="VerbatimChar"/>
     <w:rPr>
@@ -1608,28 +1711,28 @@
       <w:color w:val="60a0b0"/>
     </w:rPr>
   </w:style>
-  <w:style w:type="character" w:customStyle="1" w:styleId="OtherTok">
+  <w:style w:customStyle="1" w:styleId="OtherTok" w:type="character">
     <w:name w:val="OtherTok"/>
     <w:basedOn w:val="VerbatimChar"/>
     <w:rPr>
       <w:color w:val="007020"/>
     </w:rPr>
   </w:style>
-  <w:style w:type="character" w:customStyle="1" w:styleId="FunctionTok">
+  <w:style w:customStyle="1" w:styleId="FunctionTok" w:type="character">
     <w:name w:val="FunctionTok"/>
     <w:basedOn w:val="VerbatimChar"/>
     <w:rPr>
       <w:color w:val="06287e"/>
     </w:rPr>
   </w:style>
-  <w:style w:type="character" w:customStyle="1" w:styleId="VariableTok">
+  <w:style w:customStyle="1" w:styleId="VariableTok" w:type="character">
     <w:name w:val="VariableTok"/>
     <w:basedOn w:val="VerbatimChar"/>
     <w:rPr>
       <w:color w:val="19177c"/>
     </w:rPr>
   </w:style>
-  <w:style w:type="character" w:customStyle="1" w:styleId="ControlFlowTok">
+  <w:style w:customStyle="1" w:styleId="ControlFlowTok" w:type="character">
     <w:name w:val="ControlFlowTok"/>
     <w:basedOn w:val="VerbatimChar"/>
     <w:rPr>
@@ -1637,45 +1740,45 @@
       <w:color w:val="007020"/>
     </w:rPr>
   </w:style>
-  <w:style w:type="character" w:customStyle="1" w:styleId="OperatorTok">
+  <w:style w:customStyle="1" w:styleId="OperatorTok" w:type="character">
     <w:name w:val="OperatorTok"/>
     <w:basedOn w:val="VerbatimChar"/>
     <w:rPr>
       <w:color w:val="666666"/>
     </w:rPr>
   </w:style>
-  <w:style w:type="character" w:customStyle="1" w:styleId="BuiltInTok">
+  <w:style w:customStyle="1" w:styleId="BuiltInTok" w:type="character">
     <w:name w:val="BuiltInTok"/>
     <w:basedOn w:val="VerbatimChar"/>
     <w:rPr>
       <w:color w:val="008000"/>
     </w:rPr>
   </w:style>
-  <w:style w:type="character" w:customStyle="1" w:styleId="ExtensionTok">
+  <w:style w:customStyle="1" w:styleId="ExtensionTok" w:type="character">
     <w:name w:val="ExtensionTok"/>
     <w:basedOn w:val="VerbatimChar"/>
     <w:rPr/>
   </w:style>
-  <w:style w:type="character" w:customStyle="1" w:styleId="PreprocessorTok">
+  <w:style w:customStyle="1" w:styleId="PreprocessorTok" w:type="character">
     <w:name w:val="PreprocessorTok"/>
     <w:basedOn w:val="VerbatimChar"/>
     <w:rPr>
       <w:color w:val="bc7a00"/>
     </w:rPr>
   </w:style>
-  <w:style w:type="character" w:customStyle="1" w:styleId="AttributeTok">
+  <w:style w:customStyle="1" w:styleId="AttributeTok" w:type="character">
     <w:name w:val="AttributeTok"/>
     <w:basedOn w:val="VerbatimChar"/>
     <w:rPr>
       <w:color w:val="7d9029"/>
     </w:rPr>
   </w:style>
-  <w:style w:type="character" w:customStyle="1" w:styleId="RegionMarkerTok">
+  <w:style w:customStyle="1" w:styleId="RegionMarkerTok" w:type="character">
     <w:name w:val="RegionMarkerTok"/>
     <w:basedOn w:val="VerbatimChar"/>
     <w:rPr/>
   </w:style>
-  <w:style w:type="character" w:customStyle="1" w:styleId="InformationTok">
+  <w:style w:customStyle="1" w:styleId="InformationTok" w:type="character">
     <w:name w:val="InformationTok"/>
     <w:basedOn w:val="VerbatimChar"/>
     <w:rPr>
@@ -1684,7 +1787,7 @@
       <w:color w:val="60a0b0"/>
     </w:rPr>
   </w:style>
-  <w:style w:type="character" w:customStyle="1" w:styleId="WarningTok">
+  <w:style w:customStyle="1" w:styleId="WarningTok" w:type="character">
     <w:name w:val="WarningTok"/>
     <w:basedOn w:val="VerbatimChar"/>
     <w:rPr>
@@ -1693,7 +1796,7 @@
       <w:color w:val="60a0b0"/>
     </w:rPr>
   </w:style>
-  <w:style w:type="character" w:customStyle="1" w:styleId="AlertTok">
+  <w:style w:customStyle="1" w:styleId="AlertTok" w:type="character">
     <w:name w:val="AlertTok"/>
     <w:basedOn w:val="VerbatimChar"/>
     <w:rPr>
@@ -1701,7 +1804,7 @@
       <w:color w:val="ff0000"/>
     </w:rPr>
   </w:style>
-  <w:style w:type="character" w:customStyle="1" w:styleId="ErrorTok">
+  <w:style w:customStyle="1" w:styleId="ErrorTok" w:type="character">
     <w:name w:val="ErrorTok"/>
     <w:basedOn w:val="VerbatimChar"/>
     <w:rPr>
@@ -1709,7 +1812,7 @@
       <w:color w:val="ff0000"/>
     </w:rPr>
   </w:style>
-  <w:style w:type="character" w:customStyle="1" w:styleId="NormalTok">
+  <w:style w:customStyle="1" w:styleId="NormalTok" w:type="character">
     <w:name w:val="NormalTok"/>
     <w:basedOn w:val="VerbatimChar"/>
     <w:rPr/>

</xml_diff>